<commit_message>
docs: update project documentation to reflect recent system changes
</commit_message>
<xml_diff>
--- a/Project_Documentation.docx
+++ b/Project_Documentation.docx
@@ -1700,6 +1700,371 @@
         <w:t>4. Billing-Service ──(Feign Client)──&gt; Client-Service &amp; Attendance-Service (Collect project billing rates and timesheets to generate invoices)</w:t>
       </w:r>
     </w:p>
+    <w:p>
+      <w:pPr>
+        <w:pStyle w:val="Heading1"/>
+      </w:pPr>
+      <w:r>
+        <w:t>5. Recent Enhancements (What Was Just Added)</w:t>
+      </w:r>
+    </w:p>
+    <w:p>
+      <w:r>
+        <w:t>We have successfully upgraded the infrastructure of the project from independent, disconnected services to a structured microservices network:</w:t>
+      </w:r>
+    </w:p>
+    <w:p>
+      <w:pPr>
+        <w:pStyle w:val="ListBullet"/>
+      </w:pPr>
+      <w:r>
+        <w:t>Service Discovery Registry (Registry-Service):</w:t>
+      </w:r>
+    </w:p>
+    <w:p>
+      <w:r>
+        <w:rPr>
+          <w:rFonts w:ascii="Calibri" w:hAnsi="Calibri"/>
+        </w:rPr>
+        <w:t>Created and bootstrapped a Eureka Server (</w:t>
+      </w:r>
+      <w:r>
+        <w:rPr>
+          <w:b/>
+        </w:rPr>
+        <w:t>Registry-Service</w:t>
+      </w:r>
+      <w:r>
+        <w:rPr>
+          <w:rFonts w:ascii="Calibri" w:hAnsi="Calibri"/>
+        </w:rPr>
+        <w:t xml:space="preserve"> running on Port 8761) using </w:t>
+      </w:r>
+      <w:r>
+        <w:rPr>
+          <w:i/>
+        </w:rPr>
+        <w:t>@EnableEurekaServer</w:t>
+      </w:r>
+      <w:r>
+        <w:t>.</w:t>
+      </w:r>
+    </w:p>
+    <w:p>
+      <w:pPr>
+        <w:pStyle w:val="ListBullet"/>
+      </w:pPr>
+      <w:r>
+        <w:t>Client Registrations:</w:t>
+      </w:r>
+    </w:p>
+    <w:p>
+      <w:r>
+        <w:rPr>
+          <w:rFonts w:ascii="Calibri" w:hAnsi="Calibri"/>
+        </w:rPr>
+        <w:t xml:space="preserve">Configured both </w:t>
+      </w:r>
+      <w:r>
+        <w:rPr>
+          <w:b/>
+        </w:rPr>
+        <w:t>Employee-Service</w:t>
+      </w:r>
+      <w:r>
+        <w:rPr>
+          <w:rFonts w:ascii="Calibri" w:hAnsi="Calibri"/>
+        </w:rPr>
+        <w:t xml:space="preserve"> and </w:t>
+      </w:r>
+      <w:r>
+        <w:rPr>
+          <w:b/>
+        </w:rPr>
+        <w:t>Attendance-Service</w:t>
+      </w:r>
+      <w:r>
+        <w:rPr>
+          <w:rFonts w:ascii="Calibri" w:hAnsi="Calibri"/>
+        </w:rPr>
+        <w:t xml:space="preserve"> as Eureka discovery clients by adding </w:t>
+      </w:r>
+      <w:r>
+        <w:rPr>
+          <w:i/>
+        </w:rPr>
+        <w:t>spring-cloud-starter-netflix-eureka-client</w:t>
+      </w:r>
+      <w:r>
+        <w:rPr>
+          <w:rFonts w:ascii="Calibri" w:hAnsi="Calibri"/>
+        </w:rPr>
+        <w:t xml:space="preserve"> dependencies and pointing to the registry URL at </w:t>
+      </w:r>
+      <w:r>
+        <w:rPr>
+          <w:i/>
+        </w:rPr>
+        <w:t>http://localhost:8761/eureka/</w:t>
+      </w:r>
+      <w:r>
+        <w:t>.</w:t>
+      </w:r>
+    </w:p>
+    <w:p>
+      <w:pPr>
+        <w:pStyle w:val="ListBullet"/>
+      </w:pPr>
+      <w:r>
+        <w:t>Automatic Database Schema Initialization:</w:t>
+      </w:r>
+    </w:p>
+    <w:p>
+      <w:r>
+        <w:rPr>
+          <w:rFonts w:ascii="Calibri" w:hAnsi="Calibri"/>
+        </w:rPr>
+        <w:t xml:space="preserve">Configured MySQL datasources for both microservices with </w:t>
+      </w:r>
+      <w:r>
+        <w:rPr>
+          <w:i/>
+        </w:rPr>
+        <w:t>createDatabaseIfNotExist=true</w:t>
+      </w:r>
+      <w:r>
+        <w:rPr>
+          <w:rFonts w:ascii="Calibri" w:hAnsi="Calibri"/>
+        </w:rPr>
+        <w:t>, ensuring databases (</w:t>
+      </w:r>
+      <w:r>
+        <w:rPr>
+          <w:b/>
+        </w:rPr>
+        <w:t>employee</w:t>
+      </w:r>
+      <w:r>
+        <w:rPr>
+          <w:rFonts w:ascii="Calibri" w:hAnsi="Calibri"/>
+        </w:rPr>
+        <w:t xml:space="preserve"> and </w:t>
+      </w:r>
+      <w:r>
+        <w:rPr>
+          <w:b/>
+        </w:rPr>
+        <w:t>attendance_db</w:t>
+      </w:r>
+      <w:r>
+        <w:t>) are automatically provisioned upon application startup.</w:t>
+      </w:r>
+    </w:p>
+    <w:p>
+      <w:pPr>
+        <w:pStyle w:val="ListBullet"/>
+      </w:pPr>
+      <w:r>
+        <w:t>Local Runner Configurations:</w:t>
+      </w:r>
+    </w:p>
+    <w:p>
+      <w:r>
+        <w:rPr>
+          <w:rFonts w:ascii="Calibri" w:hAnsi="Calibri"/>
+        </w:rPr>
+        <w:t xml:space="preserve">Added multi-service launch definitions in </w:t>
+      </w:r>
+      <w:r>
+        <w:rPr>
+          <w:b/>
+        </w:rPr>
+        <w:t>.vscode/launch.json</w:t>
+      </w:r>
+      <w:r>
+        <w:t xml:space="preserve"> to concurrently spin up the Registry Service, Employee Service, and Attendance Service for simplified debugging.</w:t>
+      </w:r>
+    </w:p>
+    <w:p>
+      <w:pPr>
+        <w:pStyle w:val="Heading1"/>
+      </w:pPr>
+      <w:r>
+        <w:t>6. Next Steps (What Needs to Be Added)</w:t>
+      </w:r>
+    </w:p>
+    <w:p>
+      <w:r>
+        <w:t>To advance the development of this enterprise microservices ecosystem, we need to implement the following critical blocks:</w:t>
+      </w:r>
+    </w:p>
+    <w:p>
+      <w:pPr>
+        <w:pStyle w:val="Heading2"/>
+      </w:pPr>
+      <w:r>
+        <w:t>6.1 API Gateway Service (Spring Cloud Gateway)</w:t>
+      </w:r>
+    </w:p>
+    <w:p>
+      <w:r>
+        <w:t>We must introduce an API Gateway Service running on port 8080 to act as the single entry point. It will handle reverse proxying, routing requests based on path patterns (e.g., /employees/** -&gt; Employee-Service, /attendance/** -&gt; Attendance-Service), handling global CORS, and authenticating requests.</w:t>
+      </w:r>
+    </w:p>
+    <w:p>
+      <w:pPr>
+        <w:pStyle w:val="Heading2"/>
+      </w:pPr>
+      <w:r>
+        <w:t>6.2 Dynamic Load-Balanced Feign Client Routing</w:t>
+      </w:r>
+    </w:p>
+    <w:p>
+      <w:r>
+        <w:t>Currently, the EmployeeClient in Attendance-Service has a hardcoded URL. We need to remove the hardcoded IP/port and leverage Eureka's dynamic load balancer by referencing the service name (Employee-Service). This ensures dynamic service discovery and scaling.</w:t>
+      </w:r>
+    </w:p>
+    <w:p>
+      <w:pPr>
+        <w:pStyle w:val="Heading2"/>
+      </w:pPr>
+      <w:r>
+        <w:t>6.3 Additional Business Services</w:t>
+      </w:r>
+    </w:p>
+    <w:p>
+      <w:r>
+        <w:t>To fulfill the project requirements ('Employee and Bill Management'), we must introduce:</w:t>
+      </w:r>
+    </w:p>
+    <w:p>
+      <w:pPr>
+        <w:pStyle w:val="ListBullet"/>
+      </w:pPr>
+      <w:r>
+        <w:t>Client Management Service: Governing client company profiles, contract rules, project setup, and hourly rate policies.</w:t>
+      </w:r>
+    </w:p>
+    <w:p>
+      <w:pPr>
+        <w:pStyle w:val="ListBullet"/>
+      </w:pPr>
+      <w:r>
+        <w:t>Salary &amp; Payroll Service: Consuming employee details and working hours/overtime logs to compute salaries, deductions, and generate PDF payslips.</w:t>
+      </w:r>
+    </w:p>
+    <w:p>
+      <w:pPr>
+        <w:pStyle w:val="ListBullet"/>
+      </w:pPr>
+      <w:r>
+        <w:t>Client Bill &amp; Invoice Service: Calculating total billable hours spent by developers on projects and generating client-facing invoices.</w:t>
+      </w:r>
+    </w:p>
+    <w:p>
+      <w:pPr>
+        <w:pStyle w:val="Heading2"/>
+      </w:pPr>
+      <w:r>
+        <w:t>6.4 Centralized Configuration (Spring Cloud Config Server)</w:t>
+      </w:r>
+    </w:p>
+    <w:p>
+      <w:r>
+        <w:t>Instead of keeping configurations locally in each microservice folder, we should implement a Config Server that pulls centralized configurations from a secure Git repository.</w:t>
+      </w:r>
+    </w:p>
+    <w:p>
+      <w:pPr>
+        <w:pStyle w:val="Heading1"/>
+      </w:pPr>
+      <w:r>
+        <w:t>7. Technical Improvements (How to Make It Better)</w:t>
+      </w:r>
+    </w:p>
+    <w:p>
+      <w:r>
+        <w:t>Here is how we can elevate the current architecture to ensure production-grade security, scalability, and ease of maintenance:</w:t>
+      </w:r>
+    </w:p>
+    <w:p>
+      <w:pPr>
+        <w:pStyle w:val="Heading2"/>
+      </w:pPr>
+      <w:r>
+        <w:t>7.1 Containerization with Docker &amp; Compose</w:t>
+      </w:r>
+    </w:p>
+    <w:p>
+      <w:r>
+        <w:t>Adding a Dockerfile for each microservice and a root-level docker-compose.yml to orchestrate MySQL, Eureka Server, API Gateway, and microservices in isolated networks. This guarantees consistency and simplifies deployment.</w:t>
+      </w:r>
+    </w:p>
+    <w:p>
+      <w:pPr>
+        <w:pStyle w:val="Heading2"/>
+      </w:pPr>
+      <w:r>
+        <w:t>7.2 Distributed Tracing &amp; Centralized Monitoring</w:t>
+      </w:r>
+    </w:p>
+    <w:p>
+      <w:r>
+        <w:t>Integrating Micrometer Tracing and Zipkin/Jaeger to assign a unique Trace ID to every incoming request. We should also expose Actuator metrics to Prometheus and visualize them on Grafana dashboards.</w:t>
+      </w:r>
+    </w:p>
+    <w:p>
+      <w:pPr>
+        <w:pStyle w:val="Heading2"/>
+      </w:pPr>
+      <w:r>
+        <w:t>7.3 Resilience &amp; Fault Tolerance (Circuit Breakers)</w:t>
+      </w:r>
+    </w:p>
+    <w:p>
+      <w:r>
+        <w:t>Integrating Resilience4j on Feign client interfaces. If Employee-Service goes offline, Attendance-Service will fall back to a cached response or friendly error state, maintaining system availability.</w:t>
+      </w:r>
+    </w:p>
+    <w:p>
+      <w:pPr>
+        <w:pStyle w:val="Heading2"/>
+      </w:pPr>
+      <w:r>
+        <w:t>7.4 Distributed Caching (Redis)</w:t>
+      </w:r>
+    </w:p>
+    <w:p>
+      <w:r>
+        <w:t>Configuring a Redis cache in front of MySQL. Frequently queried data (e.g., employee details fetched by Attendance-Service) can be cached to reduce database reads and network latency.</w:t>
+      </w:r>
+    </w:p>
+    <w:p>
+      <w:pPr>
+        <w:pStyle w:val="Heading2"/>
+      </w:pPr>
+      <w:r>
+        <w:t>7.5 Event-Driven Architecture (Apache Kafka / RabbitMQ)</w:t>
+      </w:r>
+    </w:p>
+    <w:p>
+      <w:r>
+        <w:t>Integrating a message broker to enable asynchronous communication. For example, publishing an AttendanceCheckedInEvent when a user checks in, which Salary-Service and Notification-Service can process out of band.</w:t>
+      </w:r>
+    </w:p>
+    <w:p>
+      <w:pPr>
+        <w:pStyle w:val="Heading2"/>
+      </w:pPr>
+      <w:r>
+        <w:t>7.6 Database Migrations (Flyway or Liquibase)</w:t>
+      </w:r>
+    </w:p>
+    <w:p>
+      <w:r>
+        <w:t>Replacing hibernate.ddl-auto=update with Flyway or Liquibase to manage database schemas using version-controlled, incremental SQL scripts.</w:t>
+      </w:r>
+    </w:p>
     <w:sectPr>
       <w:pgSz w:w="12240" w:h="15840"/>
       <w:pgMar w:top="1440" w:right="1440" w:bottom="1440" w:left="1440" w:header="720" w:footer="720" w:gutter="0"/>

</xml_diff>